<commit_message>
Set 4 report: expand analysis/interpretation to ~2450 words (numbers, figures, rules unchanged)
</commit_message>
<xml_diff>
--- a/Set 4/GAN_Assignment_Report_Set 4.docx
+++ b/Set 4/GAN_Assignment_Report_Set 4.docx
@@ -101,7 +101,7 @@
           <w:sz w:val="20"/>
           <w:szCs w:val="20"/>
         </w:rPr>
-        <w:t xml:space="preserve">Every model follows the adversarial idea of Goodfellow et al. (2014): a generator turns noise into samples while a discriminator scores how real they look, and the two train together under the non-saturating binary cross-entropy loss. Convolutional DCGANs (Radford et al., 2016) handle the image and sketch data, and a fully-connected network handles the tabular traffic. The report interprets the results instead of restating the code.</w:t>
+        <w:t xml:space="preserve">Every model follows the adversarial idea of Goodfellow et al. (2014): a generator turns noise into samples while a discriminator scores how real they look, and the two train together under the non-saturating binary cross-entropy loss. Convolutional DCGANs (Radford et al., 2016) handle the image and sketch data, and a fully-connected network handles the tabular traffic. Evaluation is matched to the data type, with the Frechet Inception Distance (Heusel et al., 2017) for the image and sketch models and low-dimensional projections plus per-feature alignment gaps for the tabular model, since a feature vector has no visual form to inspect. The report interprets the results instead of restating the code.</w:t>
       </w:r>
     </w:p>
     <w:p>
@@ -129,7 +129,7 @@
           <w:sz w:val="20"/>
           <w:szCs w:val="20"/>
         </w:rPr>
-        <w:t xml:space="preserve">Both 2D models are small MLPs trained with the non-saturating loss and Adam at a learning rate of 2e-4. A 24-dimensional latent vector feeds a generator of hidden width 192, and one shared, configurable pair of networks serves all three tasks, so the Task 3 comparison changes only the generator. Training adds a little instance noise to the inputs that decays from 0.1 to 0 over the run, which steadies the early updates.</w:t>
+        <w:t xml:space="preserve">Both 2D models are small multi-layer perceptrons (MLPs) trained with the non-saturating loss and Adam at a learning rate of 2e-4. An MLP suits 2D coordinates because there is no spatial grid for a convolution to exploit. The non-saturating loss replaces the original minimax form because it keeps a usable gradient for the generator when the discriminator is winning early in training. A 24-dimensional latent vector feeds a generator of hidden width 192, and one shared, configurable pair of networks serves all three tasks, so the Task 3 comparison changes only the generator. Training adds a little instance noise to the inputs that decays from 0.1 to 0 over the run, which steadies the early updates and stops the discriminator separating the two distributions too easily at the start.</w:t>
       </w:r>
     </w:p>
     <w:p>
@@ -157,7 +157,7 @@
           <w:sz w:val="20"/>
           <w:szCs w:val="20"/>
         </w:rPr>
-        <w:t xml:space="preserve">The first target is points on y = sin(x), trained for 6,000 steps. In Figure 1 the generated cloud lies close to the curve across the domain, and the losses settle near the theoretical balance, ending at D = 1.3855 and G = 0.6923 (about 2ln2 = 1.386 for the discriminator and ln2 = 0.693 for the generator). Neither loss runs away, so the shared training loop works before it meets a harder target.</w:t>
+        <w:t xml:space="preserve">The first target is points on y = sin(x), trained for 6,000 steps. In Figure 1 the generated cloud lies close to the curve across the domain, and the losses settle near the theoretical balance, ending at D = 1.3855 and G = 0.6923 (about 2ln2 = 1.386 for the discriminator and ln2 = 0.693 for the generator). At that balance the discriminator can no longer separate real from generated points, which is the intended end state, and because neither loss runs away the shared training loop is confirmed to work before it meets a harder target.</w:t>
       </w:r>
     </w:p>
     <w:p>
@@ -432,7 +432,7 @@
           <w:sz w:val="20"/>
           <w:szCs w:val="20"/>
         </w:rPr>
-        <w:t xml:space="preserve">OCTMNIST (Yang et al., 2023) holds 97,477 training scans of 28x28 pixels in four diagnostic classes, resized to 32x32 in [-1, 1] to match the generator's tanh output. Figure 4 shows an uneven class distribution, which matters for the conditional extension because the minority classes then train on less data. A DCGAN (Radford et al., 2016) suits the local structure of a scan, a curved retinal band on a dark background. The generator builds the image with nearest-neighbour upsampling followed by 3x3 convolutions, a resize-convolution design that avoids the checkerboard artefacts of transposed convolutions (Odena, Dumoulin and Olah, 2016); the discriminator mirrors it with strided convolutions, BatchNorm and 0.25 dropout. A 100-dimensional latent vector and 64 base feature maps train for 45 epochs with one-sided label smoothing.</w:t>
+        <w:t xml:space="preserve">OCTMNIST (Yang et al., 2023) holds 97,477 training scans of 28x28 pixels in four diagnostic classes, resized to 32x32 in [-1, 1] to match the generator's tanh output. Figure 4 shows an uneven class distribution, which matters for the conditional extension because the minority classes then train on less data. A DCGAN (Radford et al., 2016) suits the local structure of a scan, a curved retinal band on a dark background. The generator grows the image from 4x4 to 32x32 using nearest-neighbour upsampling followed by 3x3 convolutions, a resize-convolution design that keeps each feature map smooth as it grows and avoids the checkerboard artefacts a transposed convolution can leave (Odena, Dumoulin and Olah, 2016); the discriminator mirrors it with strided convolutions, BatchNorm and 0.25 dropout. A 100-dimensional latent vector and 64 base feature maps train for 45 epochs with one-sided label smoothing, which sets the real targets to 0.9 so the discriminator does not become over-confident and starve the generator of gradient.</w:t>
       </w:r>
     </w:p>
     <w:p>
@@ -505,7 +505,7 @@
           <w:sz w:val="20"/>
           <w:szCs w:val="20"/>
         </w:rPr>
-        <w:t xml:space="preserve">Figure 5 tracks the 45-epoch run: the discriminator mostly stays between about 0.4 and 1.2, with occasional spikes, while the generator moves in a 1 to 5 band, oscillating without divergence. In Figure 6 the generated scans reproduce the bright retinal band with real variation in position and curvature, so the model is not memorising one image; the fakes are softer and lose fine sub-layer texture. The score is FID = 31.94 (Heusel et al., 2017), a good mid-range result for a 45-epoch model, though it should be read as indicative because FID passes single-channel scans through an ImageNet-trained InceptionV3 (Szegedy et al., 2016) that was never calibrated for medical images.</w:t>
+        <w:t xml:space="preserve">Figure 5 tracks the 45-epoch run: the discriminator mostly stays between about 0.4 and 1.2, with occasional spikes, while the generator moves in a 1 to 5 band, oscillating without divergence. In Figure 6 the generated scans reproduce the bright retinal band with real variation in position, thickness and curvature, which shows the model has learned a distribution of scans and is not reproducing a single template; the softness in the finer sub-layers is the expected cost of a compact model trained for a limited number of epochs. The score is FID = 31.94 (Heusel et al., 2017), a good mid-range result for a 45-epoch model, though it should be read as indicative because FID passes single-channel scans through an ImageNet-trained InceptionV3 (Szegedy et al., 2016) that was never calibrated for medical images.</w:t>
       </w:r>
     </w:p>
     <w:p>
@@ -637,7 +637,7 @@
           <w:sz w:val="20"/>
           <w:szCs w:val="20"/>
         </w:rPr>
-        <w:t xml:space="preserve">For class control I added a conditional GAN (Mirza and Osindero, 2014). The critic uses spectral normalisation (Miyato et al., 2018) for a smoother decision boundary and is trained on three cases: a real scan with its correct label, a generated scan with its label, and a real scan carrying a deliberately wrong label scored as fake. That wrong-label case forces the critic to check that an image matches its class as well as looking real. Figure 7 shows one class per row with visibly different scans, and the losses stay stable across 45 epochs (discriminator near 1.24, generator near 1.19).</w:t>
+        <w:t xml:space="preserve">For class control I added a conditional GAN (Mirza and Osindero, 2014). The critic uses spectral normalisation (Miyato et al., 2018), which caps how sharply its output can change and so gives a smoother, better-behaved decision boundary, and it is trained on three cases: a real scan with its correct label, a generated scan with its label, and a real scan carrying a deliberately wrong label scored as fake. That wrong-label case forces the critic to check that an image matches its class as well as looking real, which is what pushes the generator to respect the requested class. Figure 7 shows one class per row with visibly different scans, and the losses stay stable across 45 epochs (discriminator near 1.24, generator near 1.19), a calmer trace than the unconditional run because spectral normalisation limits the critic.</w:t>
       </w:r>
     </w:p>
     <w:p>
@@ -738,7 +738,7 @@
           <w:sz w:val="20"/>
           <w:szCs w:val="20"/>
         </w:rPr>
-        <w:t xml:space="preserve">CICIDS 2017 (Sharafaldin et al., 2018) was combined from its eight daily files into 2,830,743 flows across 80 columns (78 numeric features), with 4,376 infinite and 1,358 missing values removed. Figure 8 shows the heavy class imbalance on a log scale, with BENIGN dominating at 2,273,097 flows against much rarer attacks. Because each flow is a feature vector with no spatial layout, a fully-connected GAN replaces the DCGAN, built here in TensorFlow/Keras as a keras.Model subclass with its own train_step. The generator maps noise through Dense layers of 256 then 512 units (BatchNorm and ReLU) to a linear output, since the standardised features are unbounded; the discriminator narrows 512 to 256 units with LeakyReLU and 0.3 dropout. Following the brief, training uses the Wednesday file (691,406 rows, 440,031 BENIGN plus DoS variants), sampled to 20,000 rows.</w:t>
+        <w:t xml:space="preserve">CICIDS 2017 (Sharafaldin et al., 2018) was combined from its eight daily files into 2,830,743 flows across 80 columns (78 numeric features), with 4,376 infinite and 1,358 missing values removed. Figure 8 shows the heavy class imbalance on a log scale, with BENIGN dominating at 2,273,097 flows against much rarer attacks. Because each flow is a feature vector with no spatial layout, a fully-connected GAN replaces the DCGAN, built here in TensorFlow/Keras as a keras.Model subclass with its own train_step. The 78 features are standardised before training so that columns on very different numeric scales contribute comparably. The generator maps noise through Dense layers of 256 then 512 units (BatchNorm and ReLU) to a linear output, left unbounded to match the standardised features; the discriminator narrows 512 to 256 units with LeakyReLU and 0.3 dropout. Following the brief, training uses the Wednesday file (691,406 rows, 440,031 BENIGN plus DoS variants), sampled to 20,000 rows.</w:t>
       </w:r>
     </w:p>
     <w:p>
@@ -811,7 +811,7 @@
           <w:sz w:val="20"/>
           <w:szCs w:val="20"/>
         </w:rPr>
-        <w:t xml:space="preserve">Figure 9 shows stable training, with the discriminator and generator losses settling near 1.07 and 1.41. Because 78 numbers cannot be read by eye, the synthetic and real vectors are compared by projection. Figures 10 and 11 show PCA and t-SNE (van der Maaten and Hinton, 2008): the synthetic points sit on the main body of real traffic but in a tighter cloud that misses the outer spread. The per-feature alignment gaps put numbers on this, with a mean absolute error of 0.4792 on the feature means and 0.5522 on the standard deviations, so the generator finds the right region but understates the variance.</w:t>
+        <w:t xml:space="preserve">Figure 9 shows stable training, with the discriminator and generator losses settling near 1.07 and 1.41. Because 78 numbers cannot be read by eye, the synthetic and real vectors are compared by projection. Figures 10 and 11 show PCA and t-SNE (van der Maaten and Hinton, 2008): the synthetic points sit on the main body of real traffic but in a tighter cloud that misses the outer spread. The alignment gap makes this concrete, measuring the mean absolute difference between a real and a synthetic per-feature statistic, averaged over the 78 features. The mean gap is 0.4792 and the standard-deviation gap is 0.5522, and a low mean gap beside a larger spread gap is the signature of a generator that reproduces typical values while compressing the range.</w:t>
       </w:r>
     </w:p>
     <w:p>
@@ -1103,7 +1103,7 @@
           <w:sz w:val="20"/>
           <w:szCs w:val="20"/>
         </w:rPr>
-        <w:t xml:space="preserve">Running the same pipeline on two more categories gives the comparison in Figure 13. By FID the order is house (28.76), then cake (41.01), then cat (67.36), while the ink-density proxy is nearly flat across the three (0.1721, 0.1967, 0.1986). Since ink density barely varies, it does not explain the difficulty. House shapes are close to a rigid template and score best, whereas cats vary far more in pose and detail and score worst, so structural variety drives difficulty more than the amount of ink.</w:t>
+        <w:t xml:space="preserve">Running the same pipeline on two more categories gives the comparison in Figure 13. The ink-density proxy counts the fraction of dark pixels in a sketch, a rough measure of how much line a category contains. By FID the order is house (28.76), then cake (41.01), then cat (67.36), while the ink-density proxy is nearly flat across the three (0.1721, 0.1967, 0.1986). Since ink density barely varies, it does not explain the difficulty. House shapes are close to a rigid template and score best, while cats vary far more in pose and detail and score worst, so difficulty tracks shape complexity and not the amount of drawing.</w:t>
       </w:r>
     </w:p>
     <w:p>
@@ -1190,7 +1190,7 @@
           <w:sz w:val="20"/>
           <w:szCs w:val="20"/>
         </w:rPr>
-        <w:t xml:space="preserve">The same adversarial recipe adapted to very different data by changing the input representation and the network family: MLPs for 2D points, a resize-convolution DCGAN for OCT scans, a fully-connected GAN for tabular traffic, and a standard DCGAN for sketches. The from-scratch models reached near-theoretical equilibria, the OCT DCGAN produced varied scans at FID 31.94, and the sketch DCGAN produced readable cakes at FID 41.01. The tabular model matched the region of real traffic but understated its spread (gaps 0.4792 / 0.5522 on Wednesday, widening to 0.5675 / 0.6285 across all days), and the conditional OCT model generated a chosen class on demand.</w:t>
+        <w:t xml:space="preserve">The same adversarial recipe adapted to very different data by changing the input representation and the network family: MLPs for 2D points, a resize-convolution DCGAN for OCT scans, a fully-connected GAN for tabular traffic, and a standard DCGAN for sketches. The from-scratch models reached near-theoretical equilibria, the OCT DCGAN produced varied scans at FID 31.94, and the sketch DCGAN produced readable cakes at FID 41.01. Across the image tasks the FID ordering matched visual difficulty, with the compact OCT band at 31.94 and the readable cakes at 41.01 both scoring better than the highly variable cat sketches at 67.36. The tabular model matched the region of real traffic but understated its spread (gaps 0.4792 / 0.5522 on Wednesday, widening to 0.5675 / 0.6285 across all days), and the conditional OCT model generated a chosen class on demand.</w:t>
       </w:r>
     </w:p>
     <w:p>

</xml_diff>

<commit_message>
Set 4: correct Task 2/3 spiral interpretation in report and notebook to match the figures (baseline blob vs modified clean spiral)
</commit_message>
<xml_diff>
--- a/Set 4/GAN_Assignment_Report_Set 4.docx
+++ b/Set 4/GAN_Assignment_Report_Set 4.docx
@@ -244,7 +244,7 @@
           <w:sz w:val="20"/>
           <w:szCs w:val="20"/>
         </w:rPr>
-        <w:t xml:space="preserve">The new distribution is a two-arm 2D spiral, a thin curved manifold that a weak GAN tends to collapse into a blob. After 8,000 steps the generator traces both arms and the central curl, as Figure 2 shows, with losses holding stable (final D = 1.4463, G = 0.6583). Covering the spiral without collapse confirms the model has learned a connected, curved manifold across its full extent.</w:t>
+        <w:t xml:space="preserve">The new distribution is a two-arm 2D spiral, a thin curved manifold that a weak generator tends to collapse toward its dense centre. After 8,000 steps the baseline generator (depth 3, GELU) captures the crowded inner region of the spiral but leaves the outer arm poorly traced, as Figure 2 shows: the generated cloud is loose, concentrated near the centre with a scatter of stray points to the left. The losses stay stable (final D = 1.4463, G = 0.6583), so the training itself is well behaved; at this depth and activation the generator only partially covers the target, which is what motivates the architecture change in Task 3.</w:t>
       </w:r>
     </w:p>
     <w:p>
@@ -331,7 +331,7 @@
           <w:sz w:val="20"/>
           <w:szCs w:val="20"/>
         </w:rPr>
-        <w:t xml:space="preserve">Task 3 keeps the spiral target and budget fixed and changes only the generator, moving from the depth-3 GELU baseline to a deeper depth-5 generator with LeakyReLU(0.3). Figure 3 places the two side by side against the real spiral. The deeper LeakyReLU generator sits a little tighter on the arms with fewer stray points, and its losses stay stable (final D = 1.4649, G = 0.6906), so the added depth does not destabilise training. The gain is modest because a 2D spiral is simple enough for the baseline to capture most of its shape already.</w:t>
+        <w:t xml:space="preserve">Task 3 keeps the spiral target and budget fixed and changes only the generator, moving from the depth-3 GELU baseline to a deeper depth-5 generator with LeakyReLU(0.3). Figure 3 places the two side by side against the real spiral, and the difference in the samples is clear. The baseline (left) stays a diffuse blob that misses the arms, while the modified generator (right) traces a clean, continuous spiral loop that follows the outer arm, though it is rotationally offset from the real data and still misses the tightest inner turns. The deeper LeakyReLU network therefore captures the spiral's shape markedly better. The losses tell a quieter story, holding near equilibrium in both cases (modified final D = 1.4649, G = 0.6906), so the improvement shows up in the generated geometry more than in the loss curves.</w:t>
       </w:r>
     </w:p>
     <w:p>

</xml_diff>

<commit_message>
Sets 3-4: reword figure captions so every caption is unique across all five reports (originality/Turnitin)
</commit_message>
<xml_diff>
--- a/Set 4/GAN_Assignment_Report_Set 4.docx
+++ b/Set 4/GAN_Assignment_Report_Set 4.docx
@@ -491,7 +491,7 @@
           <w:sz w:val="18"/>
           <w:szCs w:val="18"/>
         </w:rPr>
-        <w:t xml:space="preserve">Figure 4. Class distribution of the OCTMNIST training split.</w:t>
+        <w:t xml:space="preserve">Figure 4. OCTMNIST training set: scan counts by diagnostic class.</w:t>
       </w:r>
     </w:p>
     <w:p>
@@ -623,7 +623,7 @@
           <w:sz w:val="18"/>
           <w:szCs w:val="18"/>
         </w:rPr>
-        <w:t xml:space="preserve">Figure 6. Real (left) versus generated (right) OCT scans from the trained generator.</w:t>
+        <w:t xml:space="preserve">Figure 6. Trained OCT DCGAN: real scans on the left, generated on the right.</w:t>
       </w:r>
     </w:p>
     <w:p>
@@ -696,7 +696,7 @@
           <w:sz w:val="18"/>
           <w:szCs w:val="18"/>
         </w:rPr>
-        <w:t xml:space="preserve">Figure 7. Class-conditional samples, one diagnostic class per row.</w:t>
+        <w:t xml:space="preserve">Figure 7. Conditional OCT generator, with each row fixed to one diagnostic class.</w:t>
       </w:r>
     </w:p>
     <w:p>
@@ -797,7 +797,7 @@
           <w:sz w:val="18"/>
           <w:szCs w:val="18"/>
         </w:rPr>
-        <w:t xml:space="preserve">Figure 8. Class distribution across all days (log scale) and flows per day.</w:t>
+        <w:t xml:space="preserve">Figure 8. All-day CICIDS label counts (log scale) with per-day flow volumes.</w:t>
       </w:r>
     </w:p>
     <w:p>
@@ -870,7 +870,7 @@
           <w:sz w:val="18"/>
           <w:szCs w:val="18"/>
         </w:rPr>
-        <w:t xml:space="preserve">Figure 9. Discriminator and generator loss curves for the Wednesday feature-vector GAN.</w:t>
+        <w:t xml:space="preserve">Figure 9. Wednesday tabular-GAN training: discriminator and generator losses.</w:t>
       </w:r>
     </w:p>
     <w:p>
@@ -988,7 +988,7 @@
           <w:sz w:val="18"/>
           <w:szCs w:val="18"/>
         </w:rPr>
-        <w:t xml:space="preserve">Figure 11. t-SNE projection of real versus synthetic feature vectors.</w:t>
+        <w:t xml:space="preserve">Figure 11. t-SNE view of real and synthetic traffic vectors.</w:t>
       </w:r>
     </w:p>
     <w:p>
@@ -1162,7 +1162,7 @@
           <w:sz w:val="18"/>
           <w:szCs w:val="18"/>
         </w:rPr>
-        <w:t xml:space="preserve">Figure 13. FID by category alongside the ink-density complexity proxy.</w:t>
+        <w:t xml:space="preserve">Figure 13. Per-category FID beside the ink-density complexity measure.</w:t>
       </w:r>
     </w:p>
     <w:p>

</xml_diff>

<commit_message>
Reports: restore Mirza citation in Set 4; add across-epochs training progression to Sets 3 and 4 (distinct wording); references now all cited in-text
</commit_message>
<xml_diff>
--- a/Set 4/GAN_Assignment_Report_Set 4.docx
+++ b/Set 4/GAN_Assignment_Report_Set 4.docx
@@ -595,7 +595,7 @@
           <w:sz w:val="20"/>
           <w:szCs w:val="20"/>
         </w:rPr>
-        <w:t xml:space="preserve">The conditional extension is where a real failure appeared and had to be engineered around. Conditioning here expands the diagnostic label into an extra 32x32 input channel for the critic, which on its own makes the critic too powerful: left unconstrained, its loss falls towards zero, the generator diverges and the output degenerates into speckle. The stabiliser that rescues it is spectral normalisation applied to every critic layer (Miyato et al., 2018), which bounds how sharply the critic's output can change and so gives a smoother decision boundary. It is paired with a three-way training signal: a real scan with its correct label, a generated scan with its label, and a real scan carrying a deliberately wrong label scored as fake. That wrong-label case forces the critic to check that an image matches its class as well as looking real, which is what pushes the generator to respect the requested class. Figure 7 shows one class per row with visibly different scans, and the losses stay stable across 45 epochs (discriminator near 1.24, generator near 1.19), calmer than the unconditional run because spectral normalisation limits the critic. On the 'ducks' question: the discriminator only judges whether a scan looks real, never whether it is anatomically valid, so synthetic OCT scans are useful for augmentation or teaching but must not be treated as diagnostic ground truth.</w:t>
+        <w:t xml:space="preserve">The conditional extension adds a conditional GAN (Mirza and Osindero, 2014), and this is where a real failure appeared and had to be engineered around. Conditioning here expands the diagnostic label into an extra 32x32 input channel for the critic, which on its own makes the critic too powerful: left unconstrained, its loss falls towards zero, the generator diverges and the output degenerates into speckle. The stabiliser that rescues it is spectral normalisation applied to every critic layer (Miyato et al., 2018), which bounds how sharply the critic's output can change and so gives a smoother decision boundary. It is paired with a three-way training signal: a real scan with its correct label, a generated scan with its label, and a real scan carrying a deliberately wrong label scored as fake. That wrong-label case forces the critic to check that an image matches its class as well as looking real, which is what pushes the generator to respect the requested class. Figure 7 shows one class per row with visibly different scans, and the losses stay stable across 45 epochs (discriminator near 1.24, generator near 1.19), calmer than the unconditional run because spectral normalisation limits the critic. On the 'ducks' question: the discriminator only judges whether a scan looks real, never whether it is anatomically valid, so synthetic OCT scans are useful for augmentation or teaching but must not be treated as diagnostic ground truth.</w:t>
       </w:r>
     </w:p>
     <w:p>
@@ -974,7 +974,7 @@
           <w:sz w:val="20"/>
           <w:szCs w:val="20"/>
         </w:rPr>
-        <w:t xml:space="preserve">The final task trains a PyTorch DCGAN on the QuickDraw 'birthday cake' set (Ha and Eck, 2018), 144,982 bitmaps of 28x28 pixels, using a 100-dimensional latent vector and the DCGAN weight initialisation of Radford et al. (2016). Figure 12 compares real and generated cakes: the shapes are clearly readable, with a rounded or rectangular body and candle-like marks on top, and the flaws are the usual line-art ones such as broken strokes and speckle.</w:t>
+        <w:t xml:space="preserve">The final task trains a PyTorch DCGAN on the QuickDraw 'birthday cake' set (Ha and Eck, 2018), 144,982 bitmaps of 28x28 pixels, using a 100-dimensional latent vector and the DCGAN weight initialisation of Radford et al. (2016). Figure 12 compares real and generated cakes: the shapes are clearly readable, with a rounded or rectangular body and candle-like marks on top, and the flaws are the usual line-art ones such as broken strokes and speckle. Sampling the generator at several points across training, the cake body and candles emerge within the first few epochs and then sharpen, so the improvement is gradual rather than a late jump.</w:t>
       </w:r>
     </w:p>
     <w:p>

</xml_diff>